<commit_message>
Move criterios da avaliacao pratica para o final
</commit_message>
<xml_diff>
--- a/sistema/FICHA-PRODUTO-MAIS-TECH/INTRODUCAO_COMUNICACAO_ORAL_ESCRITA/AVALIACOES/AVALIACAO_PRATICA_COMUNICACAO_ORAL_ESCRITA.docx
+++ b/sistema/FICHA-PRODUTO-MAIS-TECH/INTRODUCAO_COMUNICACAO_ORAL_ESCRITA/AVALIACOES/AVALIACAO_PRATICA_COMUNICACAO_ORAL_ESCRITA.docx
@@ -951,7 +951,89 @@
           <w:color w:val="004D5C"/>
           <w:sz w:val="30"/>
         </w:rPr>
-        <w:t>3. Critérios de avaliação</w:t>
+        <w:t>3. Autoavaliação do estudante</w:t>
+      </w:r>
+    </w:p>
+    <w:p>
+      <w:pPr>
+        <w:spacing w:after="120" w:line="276" w:lineRule="auto"/>
+      </w:pPr>
+      <w:r>
+        <w:rPr>
+          <w:rFonts w:ascii="Arial" w:hAnsi="Arial"/>
+          <w:b w:val="0"/>
+          <w:i w:val="0"/>
+          <w:color w:val="000000"/>
+          <w:sz w:val="21"/>
+        </w:rPr>
+        <w:t>Marque uma opção em cada frase:</w:t>
+      </w:r>
+    </w:p>
+    <w:p>
+      <w:pPr>
+        <w:pStyle w:val="ListBullet"/>
+        <w:spacing w:after="60"/>
+        <w:ind w:left="720" w:hanging="360"/>
+      </w:pPr>
+      <w:r>
+        <w:rPr>
+          <w:rFonts w:ascii="Arial" w:hAnsi="Arial"/>
+          <w:b w:val="0"/>
+          <w:i w:val="0"/>
+          <w:color w:val="000000"/>
+          <w:sz w:val="21"/>
+        </w:rPr>
+        <w:t>Consegui transformar uma mensagem confusa em comunicação profissional.  ☐ Sim  ☐ Parcialmente  ☐ Ainda não</w:t>
+      </w:r>
+    </w:p>
+    <w:p>
+      <w:pPr>
+        <w:pStyle w:val="ListBullet"/>
+        <w:spacing w:after="60"/>
+        <w:ind w:left="720" w:hanging="360"/>
+      </w:pPr>
+      <w:r>
+        <w:rPr>
+          <w:rFonts w:ascii="Arial" w:hAnsi="Arial"/>
+          <w:b w:val="0"/>
+          <w:i w:val="0"/>
+          <w:color w:val="000000"/>
+          <w:sz w:val="21"/>
+        </w:rPr>
+        <w:t>Falei com clareza, respeito e postura adequada.  ☐ Sim  ☐ Parcialmente  ☐ Ainda não</w:t>
+      </w:r>
+    </w:p>
+    <w:p>
+      <w:pPr>
+        <w:pStyle w:val="ListBullet"/>
+        <w:spacing w:after="60"/>
+        <w:ind w:left="720" w:hanging="360"/>
+      </w:pPr>
+      <w:r>
+        <w:rPr>
+          <w:rFonts w:ascii="Arial" w:hAnsi="Arial"/>
+          <w:b w:val="0"/>
+          <w:i w:val="0"/>
+          <w:color w:val="000000"/>
+          <w:sz w:val="21"/>
+        </w:rPr>
+        <w:t>Pratiquei escuta ativa durante a simulação.  ☐ Sim  ☐ Parcialmente  ☐ Ainda não</w:t>
+      </w:r>
+    </w:p>
+    <w:p>
+      <w:pPr>
+        <w:pStyle w:val="Heading1"/>
+        <w:keepNext/>
+      </w:pPr>
+      <w:r>
+        <w:rPr>
+          <w:rFonts w:ascii="Arial" w:hAnsi="Arial"/>
+          <w:b/>
+          <w:i w:val="0"/>
+          <w:color w:val="004D5C"/>
+          <w:sz w:val="30"/>
+        </w:rPr>
+        <w:t>4. Critérios de avaliação</w:t>
       </w:r>
     </w:p>
     <w:tbl>
@@ -2047,88 +2129,6 @@
         <w:t>____________________________________________________________________________________________</w:t>
       </w:r>
     </w:p>
-    <w:p>
-      <w:pPr>
-        <w:pStyle w:val="Heading1"/>
-        <w:keepNext/>
-      </w:pPr>
-      <w:r>
-        <w:rPr>
-          <w:rFonts w:ascii="Arial" w:hAnsi="Arial"/>
-          <w:b/>
-          <w:i w:val="0"/>
-          <w:color w:val="004D5C"/>
-          <w:sz w:val="30"/>
-        </w:rPr>
-        <w:t>4. Autoavaliação do estudante</w:t>
-      </w:r>
-    </w:p>
-    <w:p>
-      <w:pPr>
-        <w:spacing w:after="120" w:line="276" w:lineRule="auto"/>
-      </w:pPr>
-      <w:r>
-        <w:rPr>
-          <w:rFonts w:ascii="Arial" w:hAnsi="Arial"/>
-          <w:b w:val="0"/>
-          <w:i w:val="0"/>
-          <w:color w:val="000000"/>
-          <w:sz w:val="21"/>
-        </w:rPr>
-        <w:t>Marque uma opção em cada frase:</w:t>
-      </w:r>
-    </w:p>
-    <w:p>
-      <w:pPr>
-        <w:pStyle w:val="ListBullet"/>
-        <w:spacing w:after="60"/>
-        <w:ind w:left="720" w:hanging="360"/>
-      </w:pPr>
-      <w:r>
-        <w:rPr>
-          <w:rFonts w:ascii="Arial" w:hAnsi="Arial"/>
-          <w:b w:val="0"/>
-          <w:i w:val="0"/>
-          <w:color w:val="000000"/>
-          <w:sz w:val="21"/>
-        </w:rPr>
-        <w:t>Consegui transformar uma mensagem confusa em comunicação profissional.  ☐ Sim  ☐ Parcialmente  ☐ Ainda não</w:t>
-      </w:r>
-    </w:p>
-    <w:p>
-      <w:pPr>
-        <w:pStyle w:val="ListBullet"/>
-        <w:spacing w:after="60"/>
-        <w:ind w:left="720" w:hanging="360"/>
-      </w:pPr>
-      <w:r>
-        <w:rPr>
-          <w:rFonts w:ascii="Arial" w:hAnsi="Arial"/>
-          <w:b w:val="0"/>
-          <w:i w:val="0"/>
-          <w:color w:val="000000"/>
-          <w:sz w:val="21"/>
-        </w:rPr>
-        <w:t>Falei com clareza, respeito e postura adequada.  ☐ Sim  ☐ Parcialmente  ☐ Ainda não</w:t>
-      </w:r>
-    </w:p>
-    <w:p>
-      <w:pPr>
-        <w:pStyle w:val="ListBullet"/>
-        <w:spacing w:after="60"/>
-        <w:ind w:left="720" w:hanging="360"/>
-      </w:pPr>
-      <w:r>
-        <w:rPr>
-          <w:rFonts w:ascii="Arial" w:hAnsi="Arial"/>
-          <w:b w:val="0"/>
-          <w:i w:val="0"/>
-          <w:color w:val="000000"/>
-          <w:sz w:val="21"/>
-        </w:rPr>
-        <w:t>Pratiquei escuta ativa durante a simulação.  ☐ Sim  ☐ Parcialmente  ☐ Ainda não</w:t>
-      </w:r>
-    </w:p>
     <w:sectPr>
       <w:headerReference w:type="default" r:id="rId9"/>
       <w:footerReference w:type="default" r:id="rId10"/>

</xml_diff>

<commit_message>
Ajusta alternativas da autoavaliacao pratica
</commit_message>
<xml_diff>
--- a/sistema/FICHA-PRODUTO-MAIS-TECH/INTRODUCAO_COMUNICACAO_ORAL_ESCRITA/AVALIACOES/AVALIACAO_PRATICA_COMUNICACAO_ORAL_ESCRITA.docx
+++ b/sistema/FICHA-PRODUTO-MAIS-TECH/INTRODUCAO_COMUNICACAO_ORAL_ESCRITA/AVALIACOES/AVALIACAO_PRATICA_COMUNICACAO_ORAL_ESCRITA.docx
@@ -983,7 +983,55 @@
           <w:color w:val="000000"/>
           <w:sz w:val="21"/>
         </w:rPr>
-        <w:t>Consegui transformar uma mensagem confusa em comunicação profissional.  ☐ Sim  ☐ Parcialmente  ☐ Ainda não</w:t>
+        <w:t>Consegui transformar uma mensagem confusa em comunicação profissional.</w:t>
+      </w:r>
+    </w:p>
+    <w:p>
+      <w:pPr>
+        <w:spacing w:after="40"/>
+        <w:ind w:left="1080"/>
+      </w:pPr>
+      <w:r>
+        <w:rPr>
+          <w:rFonts w:ascii="Arial" w:hAnsi="Arial"/>
+          <w:b w:val="0"/>
+          <w:i w:val="0"/>
+          <w:color w:val="000000"/>
+          <w:sz w:val="20"/>
+        </w:rPr>
+        <w:t>☐ Sim</w:t>
+      </w:r>
+    </w:p>
+    <w:p>
+      <w:pPr>
+        <w:spacing w:after="40"/>
+        <w:ind w:left="1080"/>
+      </w:pPr>
+      <w:r>
+        <w:rPr>
+          <w:rFonts w:ascii="Arial" w:hAnsi="Arial"/>
+          <w:b w:val="0"/>
+          <w:i w:val="0"/>
+          <w:color w:val="000000"/>
+          <w:sz w:val="20"/>
+        </w:rPr>
+        <w:t>☐ Parcialmente — Justifique: ________________________________________________</w:t>
+      </w:r>
+    </w:p>
+    <w:p>
+      <w:pPr>
+        <w:spacing w:after="40"/>
+        <w:ind w:left="1080"/>
+      </w:pPr>
+      <w:r>
+        <w:rPr>
+          <w:rFonts w:ascii="Arial" w:hAnsi="Arial"/>
+          <w:b w:val="0"/>
+          <w:i w:val="0"/>
+          <w:color w:val="000000"/>
+          <w:sz w:val="20"/>
+        </w:rPr>
+        <w:t>☐ Não — Justifique: _______________________________________________________</w:t>
       </w:r>
     </w:p>
     <w:p>
@@ -1000,7 +1048,55 @@
           <w:color w:val="000000"/>
           <w:sz w:val="21"/>
         </w:rPr>
-        <w:t>Falei com clareza, respeito e postura adequada.  ☐ Sim  ☐ Parcialmente  ☐ Ainda não</w:t>
+        <w:t>Falei com clareza, respeito e postura adequada.</w:t>
+      </w:r>
+    </w:p>
+    <w:p>
+      <w:pPr>
+        <w:spacing w:after="40"/>
+        <w:ind w:left="1080"/>
+      </w:pPr>
+      <w:r>
+        <w:rPr>
+          <w:rFonts w:ascii="Arial" w:hAnsi="Arial"/>
+          <w:b w:val="0"/>
+          <w:i w:val="0"/>
+          <w:color w:val="000000"/>
+          <w:sz w:val="20"/>
+        </w:rPr>
+        <w:t>☐ Sim</w:t>
+      </w:r>
+    </w:p>
+    <w:p>
+      <w:pPr>
+        <w:spacing w:after="40"/>
+        <w:ind w:left="1080"/>
+      </w:pPr>
+      <w:r>
+        <w:rPr>
+          <w:rFonts w:ascii="Arial" w:hAnsi="Arial"/>
+          <w:b w:val="0"/>
+          <w:i w:val="0"/>
+          <w:color w:val="000000"/>
+          <w:sz w:val="20"/>
+        </w:rPr>
+        <w:t>☐ Parcialmente — Justifique: ________________________________________________</w:t>
+      </w:r>
+    </w:p>
+    <w:p>
+      <w:pPr>
+        <w:spacing w:after="40"/>
+        <w:ind w:left="1080"/>
+      </w:pPr>
+      <w:r>
+        <w:rPr>
+          <w:rFonts w:ascii="Arial" w:hAnsi="Arial"/>
+          <w:b w:val="0"/>
+          <w:i w:val="0"/>
+          <w:color w:val="000000"/>
+          <w:sz w:val="20"/>
+        </w:rPr>
+        <w:t>☐ Não — Justifique: _______________________________________________________</w:t>
       </w:r>
     </w:p>
     <w:p>
@@ -1017,7 +1113,55 @@
           <w:color w:val="000000"/>
           <w:sz w:val="21"/>
         </w:rPr>
-        <w:t>Pratiquei escuta ativa durante a simulação.  ☐ Sim  ☐ Parcialmente  ☐ Ainda não</w:t>
+        <w:t>Pratiquei escuta ativa durante a simulação.</w:t>
+      </w:r>
+    </w:p>
+    <w:p>
+      <w:pPr>
+        <w:spacing w:after="40"/>
+        <w:ind w:left="1080"/>
+      </w:pPr>
+      <w:r>
+        <w:rPr>
+          <w:rFonts w:ascii="Arial" w:hAnsi="Arial"/>
+          <w:b w:val="0"/>
+          <w:i w:val="0"/>
+          <w:color w:val="000000"/>
+          <w:sz w:val="20"/>
+        </w:rPr>
+        <w:t>☐ Sim</w:t>
+      </w:r>
+    </w:p>
+    <w:p>
+      <w:pPr>
+        <w:spacing w:after="40"/>
+        <w:ind w:left="1080"/>
+      </w:pPr>
+      <w:r>
+        <w:rPr>
+          <w:rFonts w:ascii="Arial" w:hAnsi="Arial"/>
+          <w:b w:val="0"/>
+          <w:i w:val="0"/>
+          <w:color w:val="000000"/>
+          <w:sz w:val="20"/>
+        </w:rPr>
+        <w:t>☐ Parcialmente — Justifique: ________________________________________________</w:t>
+      </w:r>
+    </w:p>
+    <w:p>
+      <w:pPr>
+        <w:spacing w:after="40"/>
+        <w:ind w:left="1080"/>
+      </w:pPr>
+      <w:r>
+        <w:rPr>
+          <w:rFonts w:ascii="Arial" w:hAnsi="Arial"/>
+          <w:b w:val="0"/>
+          <w:i w:val="0"/>
+          <w:color w:val="000000"/>
+          <w:sz w:val="20"/>
+        </w:rPr>
+        <w:t>☐ Não — Justifique: _______________________________________________________</w:t>
       </w:r>
     </w:p>
     <w:p>

</xml_diff>

<commit_message>
Move nota e feedback antes da situacao problema
</commit_message>
<xml_diff>
--- a/sistema/FICHA-PRODUTO-MAIS-TECH/INTRODUCAO_COMUNICACAO_ORAL_ESCRITA/AVALIACOES/AVALIACAO_PRATICA_COMUNICACAO_ORAL_ESCRITA.docx
+++ b/sistema/FICHA-PRODUTO-MAIS-TECH/INTRODUCAO_COMUNICACAO_ORAL_ESCRITA/AVALIACOES/AVALIACAO_PRATICA_COMUNICACAO_ORAL_ESCRITA.docx
@@ -152,6 +152,81 @@
         </w:tc>
       </w:tr>
     </w:tbl>
+    <w:p>
+      <w:pPr>
+        <w:spacing w:after="120" w:line="276" w:lineRule="auto"/>
+      </w:pPr>
+      <w:r>
+        <w:rPr>
+          <w:rFonts w:ascii="Arial" w:hAnsi="Arial"/>
+          <w:b w:val="0"/>
+          <w:i w:val="0"/>
+          <w:color w:val="000000"/>
+          <w:sz w:val="21"/>
+        </w:rPr>
+        <w:t>Nota final: ______ / 10,0</w:t>
+      </w:r>
+    </w:p>
+    <w:p>
+      <w:pPr>
+        <w:spacing w:after="120" w:line="276" w:lineRule="auto"/>
+      </w:pPr>
+      <w:r>
+        <w:rPr>
+          <w:rFonts w:ascii="Arial" w:hAnsi="Arial"/>
+          <w:b w:val="0"/>
+          <w:i w:val="0"/>
+          <w:color w:val="000000"/>
+          <w:sz w:val="21"/>
+        </w:rPr>
+        <w:t>Feedback do professor:</w:t>
+      </w:r>
+    </w:p>
+    <w:p>
+      <w:pPr>
+        <w:spacing w:after="100"/>
+      </w:pPr>
+      <w:r>
+        <w:rPr>
+          <w:rFonts w:ascii="Arial" w:hAnsi="Arial"/>
+          <w:b w:val="0"/>
+          <w:i w:val="0"/>
+          <w:color w:val="9AA5AA"/>
+          <w:sz w:val="18"/>
+        </w:rPr>
+        <w:t>____________________________________________________________________________________________</w:t>
+      </w:r>
+    </w:p>
+    <w:p>
+      <w:pPr>
+        <w:spacing w:after="100"/>
+      </w:pPr>
+      <w:r>
+        <w:rPr>
+          <w:rFonts w:ascii="Arial" w:hAnsi="Arial"/>
+          <w:b w:val="0"/>
+          <w:i w:val="0"/>
+          <w:color w:val="9AA5AA"/>
+          <w:sz w:val="18"/>
+        </w:rPr>
+        <w:t>____________________________________________________________________________________________</w:t>
+      </w:r>
+    </w:p>
+    <w:p>
+      <w:pPr>
+        <w:spacing w:after="100"/>
+      </w:pPr>
+      <w:r>
+        <w:rPr>
+          <w:rFonts w:ascii="Arial" w:hAnsi="Arial"/>
+          <w:b w:val="0"/>
+          <w:i w:val="0"/>
+          <w:color w:val="9AA5AA"/>
+          <w:sz w:val="18"/>
+        </w:rPr>
+        <w:t>____________________________________________________________________________________________</w:t>
+      </w:r>
+    </w:p>
     <w:p>
       <w:pPr>
         <w:pStyle w:val="Heading1"/>
@@ -2198,81 +2273,6 @@
         </w:tc>
       </w:tr>
     </w:tbl>
-    <w:p>
-      <w:pPr>
-        <w:spacing w:after="120" w:line="276" w:lineRule="auto"/>
-      </w:pPr>
-      <w:r>
-        <w:rPr>
-          <w:rFonts w:ascii="Arial" w:hAnsi="Arial"/>
-          <w:b w:val="0"/>
-          <w:i w:val="0"/>
-          <w:color w:val="000000"/>
-          <w:sz w:val="21"/>
-        </w:rPr>
-        <w:t>Nota final: ______ / 10,0</w:t>
-      </w:r>
-    </w:p>
-    <w:p>
-      <w:pPr>
-        <w:spacing w:after="120" w:line="276" w:lineRule="auto"/>
-      </w:pPr>
-      <w:r>
-        <w:rPr>
-          <w:rFonts w:ascii="Arial" w:hAnsi="Arial"/>
-          <w:b w:val="0"/>
-          <w:i w:val="0"/>
-          <w:color w:val="000000"/>
-          <w:sz w:val="21"/>
-        </w:rPr>
-        <w:t>Feedback do professor:</w:t>
-      </w:r>
-    </w:p>
-    <w:p>
-      <w:pPr>
-        <w:spacing w:after="100"/>
-      </w:pPr>
-      <w:r>
-        <w:rPr>
-          <w:rFonts w:ascii="Arial" w:hAnsi="Arial"/>
-          <w:b w:val="0"/>
-          <w:i w:val="0"/>
-          <w:color w:val="9AA5AA"/>
-          <w:sz w:val="18"/>
-        </w:rPr>
-        <w:t>____________________________________________________________________________________________</w:t>
-      </w:r>
-    </w:p>
-    <w:p>
-      <w:pPr>
-        <w:spacing w:after="100"/>
-      </w:pPr>
-      <w:r>
-        <w:rPr>
-          <w:rFonts w:ascii="Arial" w:hAnsi="Arial"/>
-          <w:b w:val="0"/>
-          <w:i w:val="0"/>
-          <w:color w:val="9AA5AA"/>
-          <w:sz w:val="18"/>
-        </w:rPr>
-        <w:t>____________________________________________________________________________________________</w:t>
-      </w:r>
-    </w:p>
-    <w:p>
-      <w:pPr>
-        <w:spacing w:after="100"/>
-      </w:pPr>
-      <w:r>
-        <w:rPr>
-          <w:rFonts w:ascii="Arial" w:hAnsi="Arial"/>
-          <w:b w:val="0"/>
-          <w:i w:val="0"/>
-          <w:color w:val="9AA5AA"/>
-          <w:sz w:val="18"/>
-        </w:rPr>
-        <w:t>____________________________________________________________________________________________</w:t>
-      </w:r>
-    </w:p>
     <w:sectPr>
       <w:headerReference w:type="default" r:id="rId9"/>
       <w:footerReference w:type="default" r:id="rId10"/>

</xml_diff>